<commit_message>
fix: clean up stale references from old vision
- Delete leftover 企鹅设定.docx from shared folder
- Fix export script README: update descriptions and dependency text
- Fix MAP files: replace 异世界/旧术语 with new island/ocean references
- Fix style/CLAUDE.md: 异世界 → 海岛与海洋
- Update root CLAUDE.md project description
- Mark PLAN.md and progress.md as outdated (pending rewrite)

Co-Authored-By: Claude Opus 4.6 <noreply@anthropic.com>
</commit_message>
<xml_diff>
--- a/design/_shared-google-drive/使用说明.docx
+++ b/design/_shared-google-drive/使用说明.docx
@@ -2,7 +2,7 @@
 <file path=word/document.xml><?xml version="1.0" encoding="utf-8"?>
 <w:document xmlns:w="http://schemas.openxmlformats.org/wordprocessingml/2006/main" xmlns:m="http://schemas.openxmlformats.org/officeDocument/2006/math" xmlns:r="http://schemas.openxmlformats.org/officeDocument/2006/relationships" xmlns:o="urn:schemas-microsoft-com:office:office" xmlns:v="urn:schemas-microsoft-com:vml" xmlns:w10="urn:schemas-microsoft-com:office:word" xmlns:a="http://schemas.openxmlformats.org/drawingml/2006/main" xmlns:pic="http://schemas.openxmlformats.org/drawingml/2006/picture" xmlns:wp="http://schemas.openxmlformats.org/drawingml/2006/wordprocessingDrawing">
   <w:body>
-    <w:bookmarkStart w:id="12" w:name="有缺陷的ai-设计文档"/>
+    <w:bookmarkStart w:id="12" w:name="ai宠物艺术教育游戏-设计文档"/>
     <w:p>
       <w:pPr>
         <w:pStyle w:val="Heading1"/>
@@ -11,7 +11,7 @@
         <w:rPr>
           <w:rFonts w:hint="eastAsia"/>
         </w:rPr>
-        <w:t xml:space="preserve">有缺陷的AI</w:t>
+        <w:t xml:space="preserve">AI宠物艺术教育游戏</w:t>
       </w:r>
       <w:r>
         <w:t xml:space="preserve"> — </w:t>
@@ -31,16 +31,7 @@
         <w:rPr>
           <w:rFonts w:hint="eastAsia"/>
         </w:rPr>
-        <w:t xml:space="preserve">一个拥有独特人格与完整成长结构的</w:t>
-      </w:r>
-      <w:r>
-        <w:t xml:space="preserve"> AI </w:t>
-      </w:r>
-      <w:r>
-        <w:rPr>
-          <w:rFonts w:hint="eastAsia"/>
-        </w:rPr>
-        <w:t xml:space="preserve">诗人应用。</w:t>
+        <w:t xml:space="preserve">一款以提升用户艺术感知能力为核心目标的艺术教育类游戏。</w:t>
       </w:r>
     </w:p>
     <w:p>
@@ -99,7 +90,7 @@
         <w:rPr>
           <w:rFonts w:hint="eastAsia"/>
         </w:rPr>
-        <w:t xml:space="preserve">项目的根基：哲学、异世界背景、终局叙事</w:t>
+        <w:t xml:space="preserve">项目的根基：海难背景、阶段结构、社区愿景</w:t>
       </w:r>
     </w:p>
     <w:p>
@@ -128,7 +119,7 @@
         <w:rPr>
           <w:rFonts w:hint="eastAsia"/>
         </w:rPr>
-        <w:t xml:space="preserve">诗人人格与企鹅设定</w:t>
+        <w:t xml:space="preserve">诗人设定与宠物设定</w:t>
       </w:r>
     </w:p>
     <w:p>
@@ -186,7 +177,7 @@
         <w:rPr>
           <w:rFonts w:hint="eastAsia"/>
         </w:rPr>
-        <w:t xml:space="preserve">产品流程、成长系统、付费、终局机制</w:t>
+        <w:t xml:space="preserve">审美能量、核心合成、面包纹路、社区机制</w:t>
       </w:r>
     </w:p>
     <w:bookmarkEnd w:id="9"/>
@@ -227,7 +218,7 @@
           <w:rStyle w:val="VerbatimChar"/>
           <w:rFonts w:hint="eastAsia"/>
         </w:rPr>
-        <w:t xml:space="preserve">角色设计（角色的使命和离别命运来自世界观）</w:t>
+        <w:t xml:space="preserve">角色设计（角色的叙事背景与阶段结构来自世界观）</w:t>
       </w:r>
       <w:r>
         <w:br/>
@@ -243,7 +234,7 @@
           <w:rStyle w:val="VerbatimChar"/>
           <w:rFonts w:hint="eastAsia"/>
         </w:rPr>
-        <w:t xml:space="preserve">系统机制（事件阈值和终局选择的叙事意义来自世界观）</w:t>
+        <w:t xml:space="preserve">系统机制（阶段机制与社区愿景的叙事意义来自世界观）</w:t>
       </w:r>
       <w:r>
         <w:br/>
@@ -259,7 +250,7 @@
           <w:rStyle w:val="VerbatimChar"/>
           <w:rFonts w:hint="eastAsia"/>
         </w:rPr>
-        <w:t xml:space="preserve">视觉风格（反映角色气质与异世界氛围）</w:t>
+        <w:t xml:space="preserve">视觉风格（反映角色气质与海岛/海洋氛围）</w:t>
       </w:r>
     </w:p>
     <w:bookmarkEnd w:id="10"/>

</xml_diff>